<commit_message>
Update of EH paper to AI
</commit_message>
<xml_diff>
--- a/dynamics_paper_v1.docx
+++ b/dynamics_paper_v1.docx
@@ -7,7 +7,7 @@
         <w:pStyle w:val="Heading1"/>
         <w:rPr/>
       </w:pPr>
-      <w:bookmarkStart w:colFirst="0" w:colLast="0" w:name="_ha3ougdi3ybp" w:id="0"/>
+      <w:bookmarkStart w:colFirst="0" w:colLast="0" w:name="_ilz0iwc2q9jt" w:id="0"/>
       <w:bookmarkEnd w:id="0"/>
       <w:r>
         <w:rPr>
@@ -137,7 +137,7 @@
         <w:pStyle w:val="Heading2"/>
         <w:rPr/>
       </w:pPr>
-      <w:bookmarkStart w:colFirst="0" w:colLast="0" w:name="_yaycdpqqskni" w:id="1"/>
+      <w:bookmarkStart w:colFirst="0" w:colLast="0" w:name="_u8ff8vq8pjw2" w:id="1"/>
       <w:bookmarkEnd w:id="1"/>
       <w:r>
         <w:rPr>
@@ -202,7 +202,7 @@
         <w:pStyle w:val="Heading2"/>
         <w:rPr/>
       </w:pPr>
-      <w:bookmarkStart w:colFirst="0" w:colLast="0" w:name="_2fmfw5yi7s4w" w:id="2"/>
+      <w:bookmarkStart w:colFirst="0" w:colLast="0" w:name="_qbo7qp2cufjq" w:id="2"/>
       <w:bookmarkEnd w:id="2"/>
       <w:r>
         <w:rPr>
@@ -335,7 +335,7 @@
         <w:pStyle w:val="Heading2"/>
         <w:rPr/>
       </w:pPr>
-      <w:bookmarkStart w:colFirst="0" w:colLast="0" w:name="_iznhrlsjdyc6" w:id="3"/>
+      <w:bookmarkStart w:colFirst="0" w:colLast="0" w:name="_x3i5f7tnzca3" w:id="3"/>
       <w:bookmarkEnd w:id="3"/>
       <w:r>
         <w:rPr>
@@ -432,7 +432,7 @@
         <w:pStyle w:val="Heading2"/>
         <w:rPr/>
       </w:pPr>
-      <w:bookmarkStart w:colFirst="0" w:colLast="0" w:name="_uod9q3jhnyg8" w:id="4"/>
+      <w:bookmarkStart w:colFirst="0" w:colLast="0" w:name="_2y8fgorxdq2l" w:id="4"/>
       <w:bookmarkEnd w:id="4"/>
       <w:r>
         <w:rPr>
@@ -446,7 +446,7 @@
         <w:pStyle w:val="Heading3"/>
         <w:rPr/>
       </w:pPr>
-      <w:bookmarkStart w:colFirst="0" w:colLast="0" w:name="_jn04tcjqamp5" w:id="5"/>
+      <w:bookmarkStart w:colFirst="0" w:colLast="0" w:name="_tgswdwfpasy4" w:id="5"/>
       <w:bookmarkEnd w:id="5"/>
       <w:r>
         <w:rPr>
@@ -535,7 +535,7 @@
         <w:pStyle w:val="Heading3"/>
         <w:rPr/>
       </w:pPr>
-      <w:bookmarkStart w:colFirst="0" w:colLast="0" w:name="_54nuilkuy85m" w:id="6"/>
+      <w:bookmarkStart w:colFirst="0" w:colLast="0" w:name="_wb0zawhvo3z7" w:id="6"/>
       <w:bookmarkEnd w:id="6"/>
       <w:r>
         <w:rPr>
@@ -692,7 +692,7 @@
         <w:pStyle w:val="Heading3"/>
         <w:rPr/>
       </w:pPr>
-      <w:bookmarkStart w:colFirst="0" w:colLast="0" w:name="_hw7mmgjn0dj1" w:id="7"/>
+      <w:bookmarkStart w:colFirst="0" w:colLast="0" w:name="_wa3nvtoxstc4" w:id="7"/>
       <w:bookmarkEnd w:id="7"/>
       <w:r>
         <w:rPr>
@@ -717,7 +717,7 @@
         <w:pStyle w:val="Heading2"/>
         <w:rPr/>
       </w:pPr>
-      <w:bookmarkStart w:colFirst="0" w:colLast="0" w:name="_ixxe5hc9wypk" w:id="8"/>
+      <w:bookmarkStart w:colFirst="0" w:colLast="0" w:name="_2vfteemvlcma" w:id="8"/>
       <w:bookmarkEnd w:id="8"/>
       <w:r>
         <w:rPr>
@@ -731,7 +731,7 @@
         <w:pStyle w:val="Heading3"/>
         <w:rPr/>
       </w:pPr>
-      <w:bookmarkStart w:colFirst="0" w:colLast="0" w:name="_u946ibm95028" w:id="9"/>
+      <w:bookmarkStart w:colFirst="0" w:colLast="0" w:name="_gv2t29ebu9jr" w:id="9"/>
       <w:bookmarkEnd w:id="9"/>
       <w:r>
         <w:rPr>
@@ -842,7 +842,7 @@
         <w:pStyle w:val="Heading3"/>
         <w:rPr/>
       </w:pPr>
-      <w:bookmarkStart w:colFirst="0" w:colLast="0" w:name="_kd9k6lsjz18c" w:id="10"/>
+      <w:bookmarkStart w:colFirst="0" w:colLast="0" w:name="_b4qdb0dxs01c" w:id="10"/>
       <w:bookmarkEnd w:id="10"/>
       <w:r>
         <w:rPr>
@@ -903,7 +903,7 @@
         <w:pStyle w:val="Heading3"/>
         <w:rPr/>
       </w:pPr>
-      <w:bookmarkStart w:colFirst="0" w:colLast="0" w:name="_11q3ai4ll3gh" w:id="11"/>
+      <w:bookmarkStart w:colFirst="0" w:colLast="0" w:name="_t87citku8mh" w:id="11"/>
       <w:bookmarkEnd w:id="11"/>
       <w:r>
         <w:rPr>
@@ -978,7 +978,7 @@
         <w:pStyle w:val="Heading3"/>
         <w:rPr/>
       </w:pPr>
-      <w:bookmarkStart w:colFirst="0" w:colLast="0" w:name="_cj3dmfxq8dv8" w:id="12"/>
+      <w:bookmarkStart w:colFirst="0" w:colLast="0" w:name="_djimkpipxydo" w:id="12"/>
       <w:bookmarkEnd w:id="12"/>
       <w:r>
         <w:rPr>
@@ -1269,7 +1269,7 @@
         <w:pStyle w:val="Heading2"/>
         <w:rPr/>
       </w:pPr>
-      <w:bookmarkStart w:colFirst="0" w:colLast="0" w:name="_y30r2gr2xqy2" w:id="13"/>
+      <w:bookmarkStart w:colFirst="0" w:colLast="0" w:name="_ov72yccrhhaw" w:id="13"/>
       <w:bookmarkEnd w:id="13"/>
       <w:r>
         <w:rPr>
@@ -1514,7 +1514,7 @@
         <w:pStyle w:val="Heading3"/>
         <w:rPr/>
       </w:pPr>
-      <w:bookmarkStart w:colFirst="0" w:colLast="0" w:name="_z590buht1sa7" w:id="14"/>
+      <w:bookmarkStart w:colFirst="0" w:colLast="0" w:name="_d08bseses0pw" w:id="14"/>
       <w:bookmarkEnd w:id="14"/>
       <w:r>
         <w:rPr>
@@ -2227,7 +2227,7 @@
         <w:pStyle w:val="Heading3"/>
         <w:rPr/>
       </w:pPr>
-      <w:bookmarkStart w:colFirst="0" w:colLast="0" w:name="_3kds4t3v0p28" w:id="15"/>
+      <w:bookmarkStart w:colFirst="0" w:colLast="0" w:name="_he3ebqyjgw4e" w:id="15"/>
       <w:bookmarkEnd w:id="15"/>
       <w:r>
         <w:rPr>
@@ -2366,7 +2366,7 @@
         <w:pStyle w:val="Heading2"/>
         <w:rPr/>
       </w:pPr>
-      <w:bookmarkStart w:colFirst="0" w:colLast="0" w:name="_hr6yzgwfreui" w:id="16"/>
+      <w:bookmarkStart w:colFirst="0" w:colLast="0" w:name="_c42yu7613gw" w:id="16"/>
       <w:bookmarkEnd w:id="16"/>
       <w:r>
         <w:rPr>
@@ -2380,7 +2380,7 @@
         <w:pStyle w:val="Heading3"/>
         <w:rPr/>
       </w:pPr>
-      <w:bookmarkStart w:colFirst="0" w:colLast="0" w:name="_ais09vut0daj" w:id="17"/>
+      <w:bookmarkStart w:colFirst="0" w:colLast="0" w:name="_5a6ujyi54n56" w:id="17"/>
       <w:bookmarkEnd w:id="17"/>
       <w:r>
         <w:rPr>
@@ -2469,7 +2469,7 @@
         <w:pStyle w:val="Heading3"/>
         <w:rPr/>
       </w:pPr>
-      <w:bookmarkStart w:colFirst="0" w:colLast="0" w:name="_anwslhrqz3bv" w:id="18"/>
+      <w:bookmarkStart w:colFirst="0" w:colLast="0" w:name="_ki8t3jwmd5zv" w:id="18"/>
       <w:bookmarkEnd w:id="18"/>
       <w:r>
         <w:rPr>
@@ -2508,7 +2508,7 @@
         <w:pStyle w:val="Heading2"/>
         <w:rPr/>
       </w:pPr>
-      <w:bookmarkStart w:colFirst="0" w:colLast="0" w:name="_oqpbypnun8cb" w:id="19"/>
+      <w:bookmarkStart w:colFirst="0" w:colLast="0" w:name="_or2k8udohp36" w:id="19"/>
       <w:bookmarkEnd w:id="19"/>
       <w:r>
         <w:rPr>
@@ -2701,7 +2701,7 @@
         <w:pStyle w:val="Heading2"/>
         <w:rPr/>
       </w:pPr>
-      <w:bookmarkStart w:colFirst="0" w:colLast="0" w:name="_n8nkyje538r4" w:id="20"/>
+      <w:bookmarkStart w:colFirst="0" w:colLast="0" w:name="_f0pha7q22r1j" w:id="20"/>
       <w:bookmarkEnd w:id="20"/>
       <w:r>
         <w:rPr>
@@ -2715,7 +2715,7 @@
         <w:pStyle w:val="Heading3"/>
         <w:rPr/>
       </w:pPr>
-      <w:bookmarkStart w:colFirst="0" w:colLast="0" w:name="_on54dvxiajwa" w:id="21"/>
+      <w:bookmarkStart w:colFirst="0" w:colLast="0" w:name="_4ves0wrio8e0" w:id="21"/>
       <w:bookmarkEnd w:id="21"/>
       <w:r>
         <w:rPr>
@@ -2790,7 +2790,7 @@
         <w:pStyle w:val="Heading3"/>
         <w:rPr/>
       </w:pPr>
-      <w:bookmarkStart w:colFirst="0" w:colLast="0" w:name="_oix5t58ykdht" w:id="22"/>
+      <w:bookmarkStart w:colFirst="0" w:colLast="0" w:name="_cfxiuwxp5iku" w:id="22"/>
       <w:bookmarkEnd w:id="22"/>
       <w:r>
         <w:rPr>
@@ -2991,7 +2991,7 @@
         <w:pStyle w:val="Heading2"/>
         <w:rPr/>
       </w:pPr>
-      <w:bookmarkStart w:colFirst="0" w:colLast="0" w:name="_7aqgkvfwsumf" w:id="23"/>
+      <w:bookmarkStart w:colFirst="0" w:colLast="0" w:name="_ddn11lxl9x2j" w:id="23"/>
       <w:bookmarkEnd w:id="23"/>
       <w:r>
         <w:rPr>
@@ -3016,7 +3016,7 @@
         <w:pStyle w:val="Heading3"/>
         <w:rPr/>
       </w:pPr>
-      <w:bookmarkStart w:colFirst="0" w:colLast="0" w:name="_gffuvabz9odn" w:id="24"/>
+      <w:bookmarkStart w:colFirst="0" w:colLast="0" w:name="_uhea4j85m8qp" w:id="24"/>
       <w:bookmarkEnd w:id="24"/>
       <w:r>
         <w:rPr>
@@ -3113,7 +3113,7 @@
         <w:pStyle w:val="Heading3"/>
         <w:rPr/>
       </w:pPr>
-      <w:bookmarkStart w:colFirst="0" w:colLast="0" w:name="_oyp01o8h3ij3" w:id="25"/>
+      <w:bookmarkStart w:colFirst="0" w:colLast="0" w:name="_w6rt1falv3gx" w:id="25"/>
       <w:bookmarkEnd w:id="25"/>
       <w:r>
         <w:rPr>
@@ -3174,7 +3174,7 @@
         <w:pStyle w:val="Heading3"/>
         <w:rPr/>
       </w:pPr>
-      <w:bookmarkStart w:colFirst="0" w:colLast="0" w:name="_xd7tx5k51ftp" w:id="26"/>
+      <w:bookmarkStart w:colFirst="0" w:colLast="0" w:name="_p7f7muk9jpoe" w:id="26"/>
       <w:bookmarkEnd w:id="26"/>
       <w:r>
         <w:rPr>
@@ -3349,7 +3349,7 @@
         <w:pStyle w:val="Heading3"/>
         <w:rPr/>
       </w:pPr>
-      <w:bookmarkStart w:colFirst="0" w:colLast="0" w:name="_snnxeanlj5tq" w:id="27"/>
+      <w:bookmarkStart w:colFirst="0" w:colLast="0" w:name="_ru4n3s1a9xkf" w:id="27"/>
       <w:bookmarkEnd w:id="27"/>
       <w:r>
         <w:rPr>
@@ -3446,7 +3446,7 @@
         <w:pStyle w:val="Heading3"/>
         <w:rPr/>
       </w:pPr>
-      <w:bookmarkStart w:colFirst="0" w:colLast="0" w:name="_dgr8bjmizvop" w:id="28"/>
+      <w:bookmarkStart w:colFirst="0" w:colLast="0" w:name="_xyeoe1iagg5i" w:id="28"/>
       <w:bookmarkEnd w:id="28"/>
       <w:r>
         <w:rPr>
@@ -3603,7 +3603,7 @@
         <w:pStyle w:val="Heading3"/>
         <w:rPr/>
       </w:pPr>
-      <w:bookmarkStart w:colFirst="0" w:colLast="0" w:name="_jepv93z99o5m" w:id="29"/>
+      <w:bookmarkStart w:colFirst="0" w:colLast="0" w:name="_l1336160h2mm" w:id="29"/>
       <w:bookmarkEnd w:id="29"/>
       <w:r>
         <w:rPr>
@@ -3736,7 +3736,7 @@
         <w:pStyle w:val="Heading3"/>
         <w:rPr/>
       </w:pPr>
-      <w:bookmarkStart w:colFirst="0" w:colLast="0" w:name="_xwm7muqz9ora" w:id="30"/>
+      <w:bookmarkStart w:colFirst="0" w:colLast="0" w:name="_33eadsj8jneb" w:id="30"/>
       <w:bookmarkEnd w:id="30"/>
       <w:r>
         <w:rPr>
@@ -3811,7 +3811,7 @@
         <w:pStyle w:val="Heading3"/>
         <w:rPr/>
       </w:pPr>
-      <w:bookmarkStart w:colFirst="0" w:colLast="0" w:name="_6gmvxi6uy01w" w:id="31"/>
+      <w:bookmarkStart w:colFirst="0" w:colLast="0" w:name="_xs54jjt0cfko" w:id="31"/>
       <w:bookmarkEnd w:id="31"/>
       <w:r>
         <w:rPr>
@@ -3872,7 +3872,7 @@
         <w:pStyle w:val="Heading2"/>
         <w:rPr/>
       </w:pPr>
-      <w:bookmarkStart w:colFirst="0" w:colLast="0" w:name="_xrcmex9x8x8z" w:id="32"/>
+      <w:bookmarkStart w:colFirst="0" w:colLast="0" w:name="_t2bvywxymn81" w:id="32"/>
       <w:bookmarkEnd w:id="32"/>
       <w:r>
         <w:rPr>
@@ -3886,7 +3886,7 @@
         <w:pStyle w:val="Heading3"/>
         <w:rPr/>
       </w:pPr>
-      <w:bookmarkStart w:colFirst="0" w:colLast="0" w:name="_ti1rwhx7fila" w:id="33"/>
+      <w:bookmarkStart w:colFirst="0" w:colLast="0" w:name="_u66u3xejwvse" w:id="33"/>
       <w:bookmarkEnd w:id="33"/>
       <w:r>
         <w:rPr>
@@ -3911,7 +3911,7 @@
         <w:pStyle w:val="Heading3"/>
         <w:rPr/>
       </w:pPr>
-      <w:bookmarkStart w:colFirst="0" w:colLast="0" w:name="_becrebyd079j" w:id="34"/>
+      <w:bookmarkStart w:colFirst="0" w:colLast="0" w:name="_h5o9zcnyxugp" w:id="34"/>
       <w:bookmarkEnd w:id="34"/>
       <w:r>
         <w:rPr>
@@ -3936,7 +3936,7 @@
         <w:pStyle w:val="Heading3"/>
         <w:rPr/>
       </w:pPr>
-      <w:bookmarkStart w:colFirst="0" w:colLast="0" w:name="_2pbg4blh41n" w:id="35"/>
+      <w:bookmarkStart w:colFirst="0" w:colLast="0" w:name="_ixztykdvm2jh" w:id="35"/>
       <w:bookmarkEnd w:id="35"/>
       <w:r>
         <w:rPr>
@@ -3961,7 +3961,7 @@
         <w:pStyle w:val="Heading2"/>
         <w:rPr/>
       </w:pPr>
-      <w:bookmarkStart w:colFirst="0" w:colLast="0" w:name="_wfjw5uy5w3nj" w:id="36"/>
+      <w:bookmarkStart w:colFirst="0" w:colLast="0" w:name="_pydcjjl5aru2" w:id="36"/>
       <w:bookmarkEnd w:id="36"/>
       <w:r>
         <w:rPr>
@@ -4022,7 +4022,7 @@
         <w:pStyle w:val="Heading2"/>
         <w:rPr/>
       </w:pPr>
-      <w:bookmarkStart w:colFirst="0" w:colLast="0" w:name="_jgn5iv2g7a2d" w:id="37"/>
+      <w:bookmarkStart w:colFirst="0" w:colLast="0" w:name="_xdkjam6kdi9j" w:id="37"/>
       <w:bookmarkEnd w:id="37"/>
       <w:r>
         <w:rPr>
@@ -4651,7 +4651,7 @@
         <w:pStyle w:val="Heading2"/>
         <w:rPr/>
       </w:pPr>
-      <w:bookmarkStart w:colFirst="0" w:colLast="0" w:name="_71ql0r96ohy2" w:id="38"/>
+      <w:bookmarkStart w:colFirst="0" w:colLast="0" w:name="_8w7e11zdr8mm" w:id="38"/>
       <w:bookmarkEnd w:id="38"/>
       <w:r>
         <w:rPr>

</xml_diff>